<commit_message>
docs(audits): roteiros UAT v1.1 PT-BR — amigavel (4 personas, ~3h) + tour completo (15 modulos, ~6-8h)
</commit_message>
<xml_diff>
--- a/docs/audits/SSE_Roteiro_Testes_Amigavel_v1.docx
+++ b/docs/audits/SSE_Roteiro_Testes_Amigavel_v1.docx
@@ -141,7 +141,7 @@
           <w:sz w:val="22"/>
           <w:szCs w:val="22"/>
         </w:rPr>
-        <w:t xml:space="preserve">Versão 1.0 · 28 de abril de 2026</w:t>
+        <w:t xml:space="preserve">Versão 1.1 · 9 de maio de 2026</w:t>
       </w:r>
     </w:p>
     <w:p>
@@ -1313,7 +1313,7 @@
       <w:pPr>
         <w:spacing w:after="200"/>
       </w:pPr>
-      <w:hyperlink w:history="1" r:id="rIdvla6m3lh8nymddp9si4nc">
+      <w:hyperlink w:history="1" r:id="rIdozlceikjrsxb0o8v90u-j">
         <w:r>
           <w:rPr>
             <w:rStyle w:val="Hyperlink"/>
@@ -1769,7 +1769,7 @@
                 <w:bCs/>
                 <w:color w:val="78350F"/>
               </w:rPr>
-              <w:t xml:space="preserve">Atenção: o “tenant Acme” precisa estar populado</w:t>
+              <w:t xml:space="preserve">Atenção: 2 coisas precisam estar prontas antes de você começar</w:t>
             </w:r>
           </w:p>
           <w:p>
@@ -1781,7 +1781,7 @@
                 <w:sz w:val="22"/>
                 <w:szCs w:val="22"/>
               </w:rPr>
-              <w:t xml:space="preserve">Antes de você começar, o Luigi precisa confirmar que a oficina fictícia “Acme Auto Body” já foi carregada com dados de teste (clientes, veículos, etc.).</w:t>
+              <w:t xml:space="preserve">1. O staging precisa estar com a correção do frontend liberada. Há uma correção em andamento (BUG-03 PR #77) que faz o site conversar corretamente com o servidor. Sem ela, você consegue até logar mas a tela fica em branco quando carrega dados.</w:t>
             </w:r>
           </w:p>
           <w:p>
@@ -1793,7 +1793,31 @@
                 <w:sz w:val="22"/>
                 <w:szCs w:val="22"/>
               </w:rPr>
-              <w:t xml:space="preserve">Se você fizer login e a tela estiver completamente vazia (“No customers found” ou similar em todas as listas), avise o Luigi antes de continuar — ele vai rodar um comando rápido e te liberar.</w:t>
+              <w:t xml:space="preserve">2. O “tenant Acme” precisa estar populado. A oficina fictícia “Acme Auto Body” precisa ter sido carregada com dados de teste — clientes, veículos, etc. Isso é uma etapa de operação, registrada como tarefa T-20260509-2 no nosso sistema interno.</w:t>
+            </w:r>
+          </w:p>
+          <w:p>
+            <w:pPr>
+              <w:spacing w:after="60"/>
+            </w:pPr>
+            <w:r>
+              <w:rPr>
+                <w:sz w:val="22"/>
+                <w:szCs w:val="22"/>
+              </w:rPr>
+              <w:t xml:space="preserve"/>
+            </w:r>
+          </w:p>
+          <w:p>
+            <w:pPr>
+              <w:spacing w:after="60"/>
+            </w:pPr>
+            <w:r>
+              <w:rPr>
+                <w:sz w:val="22"/>
+                <w:szCs w:val="22"/>
+              </w:rPr>
+              <w:t xml:space="preserve">Como saber se está pronto: o Luigi vai te avisar. Mas se você tentar e a tela estiver completamente vazia (“No customers found” em todas as listas), avise o Luigi antes de continuar — ele vai destravar e te liberar.</w:t>
             </w:r>
           </w:p>
           <w:p>

</xml_diff>